<commit_message>
Updated Git HOL 4 Report
</commit_message>
<xml_diff>
--- a/Deepskilling/Module-11–VersionControl-GIT/Git-HOL-4-Report.docx
+++ b/Deepskilling/Module-11–VersionControl-GIT/Git-HOL-4-Report.docx
@@ -59,7 +59,7 @@
     <w:p>
       <w:r>
         <w:pict w14:anchorId="119B71DA">
-          <v:rect id="_x0000_i1139" style="width:0;height:1.5pt" o:hralign="center" o:hrstd="t" o:hr="t" fillcolor="#a0a0a0" stroked="f"/>
+          <v:rect id="_x0000_i1025" style="width:0;height:1.5pt" o:hralign="center" o:hrstd="t" o:hr="t" fillcolor="#a0a0a0" stroked="f"/>
         </w:pict>
       </w:r>
     </w:p>
@@ -103,7 +103,7 @@
     <w:p>
       <w:r>
         <w:pict w14:anchorId="136B64DB">
-          <v:rect id="_x0000_i1140" style="width:0;height:1.5pt" o:hralign="center" o:hrstd="t" o:hr="t" fillcolor="#a0a0a0" stroked="f"/>
+          <v:rect id="_x0000_i1026" style="width:0;height:1.5pt" o:hralign="center" o:hrstd="t" o:hr="t" fillcolor="#a0a0a0" stroked="f"/>
         </w:pict>
       </w:r>
     </w:p>
@@ -158,7 +158,41 @@
           <w:i/>
           <w:iCs/>
         </w:rPr>
-        <w:t>(Paste Screenshot Here)</w:t>
+        <w:drawing>
+          <wp:inline distT="0" distB="0" distL="0" distR="0" wp14:anchorId="08CA2BBC" wp14:editId="2EF1BE23">
+            <wp:extent cx="5731510" cy="1468120"/>
+            <wp:effectExtent l="0" t="0" r="2540" b="0"/>
+            <wp:docPr id="1528566125" name="Picture 1"/>
+            <wp:cNvGraphicFramePr>
+              <a:graphicFrameLocks xmlns:a="http://schemas.openxmlformats.org/drawingml/2006/main" noChangeAspect="1"/>
+            </wp:cNvGraphicFramePr>
+            <a:graphic xmlns:a="http://schemas.openxmlformats.org/drawingml/2006/main">
+              <a:graphicData uri="http://schemas.openxmlformats.org/drawingml/2006/picture">
+                <pic:pic xmlns:pic="http://schemas.openxmlformats.org/drawingml/2006/picture">
+                  <pic:nvPicPr>
+                    <pic:cNvPr id="1528566125" name=""/>
+                    <pic:cNvPicPr/>
+                  </pic:nvPicPr>
+                  <pic:blipFill>
+                    <a:blip r:embed="rId5"/>
+                    <a:stretch>
+                      <a:fillRect/>
+                    </a:stretch>
+                  </pic:blipFill>
+                  <pic:spPr>
+                    <a:xfrm>
+                      <a:off x="0" y="0"/>
+                      <a:ext cx="5731510" cy="1468120"/>
+                    </a:xfrm>
+                    <a:prstGeom prst="rect">
+                      <a:avLst/>
+                    </a:prstGeom>
+                  </pic:spPr>
+                </pic:pic>
+              </a:graphicData>
+            </a:graphic>
+          </wp:inline>
+        </w:drawing>
       </w:r>
     </w:p>
     <w:p>
@@ -177,7 +211,7 @@
     <w:p>
       <w:r>
         <w:pict w14:anchorId="1A08E2ED">
-          <v:rect id="_x0000_i1141" style="width:0;height:1.5pt" o:hralign="center" o:hrstd="t" o:hr="t" fillcolor="#a0a0a0" stroked="f"/>
+          <v:rect id="_x0000_i1027" style="width:0;height:1.5pt" o:hralign="center" o:hrstd="t" o:hr="t" fillcolor="#a0a0a0" stroked="f"/>
         </w:pict>
       </w:r>
     </w:p>
@@ -247,15 +281,48 @@
           <w:i/>
           <w:iCs/>
         </w:rPr>
-        <w:t>(Paste Screenshot Here)</w:t>
-      </w:r>
-    </w:p>
-    <w:p>
-      <w:r>
-        <w:rPr>
-          <w:b/>
-          <w:bCs/>
-        </w:rPr>
+        <w:drawing>
+          <wp:inline distT="0" distB="0" distL="0" distR="0" wp14:anchorId="707896A5" wp14:editId="58BDBE73">
+            <wp:extent cx="5731510" cy="516890"/>
+            <wp:effectExtent l="0" t="0" r="2540" b="0"/>
+            <wp:docPr id="1885033380" name="Picture 1"/>
+            <wp:cNvGraphicFramePr>
+              <a:graphicFrameLocks xmlns:a="http://schemas.openxmlformats.org/drawingml/2006/main" noChangeAspect="1"/>
+            </wp:cNvGraphicFramePr>
+            <a:graphic xmlns:a="http://schemas.openxmlformats.org/drawingml/2006/main">
+              <a:graphicData uri="http://schemas.openxmlformats.org/drawingml/2006/picture">
+                <pic:pic xmlns:pic="http://schemas.openxmlformats.org/drawingml/2006/picture">
+                  <pic:nvPicPr>
+                    <pic:cNvPr id="1885033380" name=""/>
+                    <pic:cNvPicPr/>
+                  </pic:nvPicPr>
+                  <pic:blipFill>
+                    <a:blip r:embed="rId6"/>
+                    <a:stretch>
+                      <a:fillRect/>
+                    </a:stretch>
+                  </pic:blipFill>
+                  <pic:spPr>
+                    <a:xfrm>
+                      <a:off x="0" y="0"/>
+                      <a:ext cx="5731510" cy="516890"/>
+                    </a:xfrm>
+                    <a:prstGeom prst="rect">
+                      <a:avLst/>
+                    </a:prstGeom>
+                  </pic:spPr>
+                </pic:pic>
+              </a:graphicData>
+            </a:graphic>
+          </wp:inline>
+        </w:drawing>
+      </w:r>
+      <w:r>
+        <w:rPr>
+          <w:b/>
+          <w:bCs/>
+        </w:rPr>
+        <w:lastRenderedPageBreak/>
         <w:t>Observation:</w:t>
       </w:r>
       <w:r>
@@ -278,7 +345,7 @@
     <w:p>
       <w:r>
         <w:pict w14:anchorId="61F66EDE">
-          <v:rect id="_x0000_i1142" style="width:0;height:1.5pt" o:hralign="center" o:hrstd="t" o:hr="t" fillcolor="#a0a0a0" stroked="f"/>
+          <v:rect id="_x0000_i1028" style="width:0;height:1.5pt" o:hralign="center" o:hrstd="t" o:hr="t" fillcolor="#a0a0a0" stroked="f"/>
         </w:pict>
       </w:r>
     </w:p>
@@ -341,7 +408,286 @@
           <w:i/>
           <w:iCs/>
         </w:rPr>
-        <w:t>(Paste Screenshot Here)</w:t>
+        <w:drawing>
+          <wp:inline distT="0" distB="0" distL="0" distR="0" wp14:anchorId="54379A03" wp14:editId="0BE7CBF5">
+            <wp:extent cx="5731510" cy="295910"/>
+            <wp:effectExtent l="0" t="0" r="2540" b="8890"/>
+            <wp:docPr id="1532742547" name="Picture 1"/>
+            <wp:cNvGraphicFramePr>
+              <a:graphicFrameLocks xmlns:a="http://schemas.openxmlformats.org/drawingml/2006/main" noChangeAspect="1"/>
+            </wp:cNvGraphicFramePr>
+            <a:graphic xmlns:a="http://schemas.openxmlformats.org/drawingml/2006/main">
+              <a:graphicData uri="http://schemas.openxmlformats.org/drawingml/2006/picture">
+                <pic:pic xmlns:pic="http://schemas.openxmlformats.org/drawingml/2006/picture">
+                  <pic:nvPicPr>
+                    <pic:cNvPr id="1532742547" name=""/>
+                    <pic:cNvPicPr/>
+                  </pic:nvPicPr>
+                  <pic:blipFill>
+                    <a:blip r:embed="rId7"/>
+                    <a:stretch>
+                      <a:fillRect/>
+                    </a:stretch>
+                  </pic:blipFill>
+                  <pic:spPr>
+                    <a:xfrm>
+                      <a:off x="0" y="0"/>
+                      <a:ext cx="5731510" cy="295910"/>
+                    </a:xfrm>
+                    <a:prstGeom prst="rect">
+                      <a:avLst/>
+                    </a:prstGeom>
+                  </pic:spPr>
+                </pic:pic>
+              </a:graphicData>
+            </a:graphic>
+          </wp:inline>
+        </w:drawing>
+      </w:r>
+    </w:p>
+    <w:p>
+      <w:r>
+        <w:rPr>
+          <w:b/>
+          <w:bCs/>
+        </w:rPr>
+        <w:t>Observation:</w:t>
+      </w:r>
+      <w:r>
+        <w:br/>
+        <w:t xml:space="preserve">Created hello.xml in </w:t>
+      </w:r>
+      <w:proofErr w:type="spellStart"/>
+      <w:r>
+        <w:t>GitWork</w:t>
+      </w:r>
+      <w:proofErr w:type="spellEnd"/>
+      <w:r>
+        <w:t xml:space="preserve"> branch.</w:t>
+      </w:r>
+    </w:p>
+    <w:p>
+      <w:r>
+        <w:pict w14:anchorId="46083382">
+          <v:rect id="_x0000_i1029" style="width:0;height:1.5pt" o:hralign="center" o:hrstd="t" o:hr="t" fillcolor="#a0a0a0" stroked="f"/>
+        </w:pict>
+      </w:r>
+    </w:p>
+    <w:p>
+      <w:pPr>
+        <w:rPr>
+          <w:b/>
+          <w:bCs/>
+        </w:rPr>
+      </w:pPr>
+      <w:r>
+        <w:rPr>
+          <w:b/>
+          <w:bCs/>
+        </w:rPr>
+        <w:t>Step 4: Commit Changes</w:t>
+      </w:r>
+    </w:p>
+    <w:p>
+      <w:pPr>
+        <w:rPr>
+          <w:b/>
+          <w:bCs/>
+        </w:rPr>
+      </w:pPr>
+      <w:r>
+        <w:rPr>
+          <w:b/>
+          <w:bCs/>
+        </w:rPr>
+        <w:t>Commands</w:t>
+      </w:r>
+    </w:p>
+    <w:p>
+      <w:r>
+        <w:t>git add hello.xml</w:t>
+      </w:r>
+    </w:p>
+    <w:p>
+      <w:r>
+        <w:t xml:space="preserve">git commit -m "Added hello.xml in </w:t>
+      </w:r>
+      <w:proofErr w:type="spellStart"/>
+      <w:r>
+        <w:t>GitWork</w:t>
+      </w:r>
+      <w:proofErr w:type="spellEnd"/>
+      <w:r>
+        <w:t>"</w:t>
+      </w:r>
+    </w:p>
+    <w:p>
+      <w:r>
+        <w:rPr>
+          <w:b/>
+          <w:bCs/>
+        </w:rPr>
+        <w:t>Output:</w:t>
+      </w:r>
+      <w:r>
+        <w:rPr>
+          <w:noProof/>
+        </w:rPr>
+        <w:t xml:space="preserve"> </w:t>
+      </w:r>
+      <w:r>
+        <w:drawing>
+          <wp:inline distT="0" distB="0" distL="0" distR="0" wp14:anchorId="6A41AC40" wp14:editId="4CE3C564">
+            <wp:extent cx="5731510" cy="929640"/>
+            <wp:effectExtent l="0" t="0" r="2540" b="3810"/>
+            <wp:docPr id="506200486" name="Picture 1"/>
+            <wp:cNvGraphicFramePr>
+              <a:graphicFrameLocks xmlns:a="http://schemas.openxmlformats.org/drawingml/2006/main" noChangeAspect="1"/>
+            </wp:cNvGraphicFramePr>
+            <a:graphic xmlns:a="http://schemas.openxmlformats.org/drawingml/2006/main">
+              <a:graphicData uri="http://schemas.openxmlformats.org/drawingml/2006/picture">
+                <pic:pic xmlns:pic="http://schemas.openxmlformats.org/drawingml/2006/picture">
+                  <pic:nvPicPr>
+                    <pic:cNvPr id="506200486" name=""/>
+                    <pic:cNvPicPr/>
+                  </pic:nvPicPr>
+                  <pic:blipFill>
+                    <a:blip r:embed="rId8"/>
+                    <a:stretch>
+                      <a:fillRect/>
+                    </a:stretch>
+                  </pic:blipFill>
+                  <pic:spPr>
+                    <a:xfrm>
+                      <a:off x="0" y="0"/>
+                      <a:ext cx="5731510" cy="929640"/>
+                    </a:xfrm>
+                    <a:prstGeom prst="rect">
+                      <a:avLst/>
+                    </a:prstGeom>
+                  </pic:spPr>
+                </pic:pic>
+              </a:graphicData>
+            </a:graphic>
+          </wp:inline>
+        </w:drawing>
+      </w:r>
+    </w:p>
+    <w:p>
+      <w:r>
+        <w:rPr>
+          <w:b/>
+          <w:bCs/>
+        </w:rPr>
+        <w:t>Observation:</w:t>
+      </w:r>
+      <w:r>
+        <w:br/>
+        <w:t>The file was committed successfully.</w:t>
+      </w:r>
+    </w:p>
+    <w:p>
+      <w:r>
+        <w:pict w14:anchorId="43ACDB8B">
+          <v:rect id="_x0000_i1030" style="width:0;height:1.5pt" o:hralign="center" o:hrstd="t" o:hr="t" fillcolor="#a0a0a0" stroked="f"/>
+        </w:pict>
+      </w:r>
+    </w:p>
+    <w:p>
+      <w:pPr>
+        <w:rPr>
+          <w:b/>
+          <w:bCs/>
+        </w:rPr>
+      </w:pPr>
+      <w:r>
+        <w:rPr>
+          <w:b/>
+          <w:bCs/>
+        </w:rPr>
+        <w:t>Step 5: Switch to Main Branch</w:t>
+      </w:r>
+    </w:p>
+    <w:p>
+      <w:pPr>
+        <w:rPr>
+          <w:b/>
+          <w:bCs/>
+        </w:rPr>
+      </w:pPr>
+      <w:r>
+        <w:rPr>
+          <w:b/>
+          <w:bCs/>
+        </w:rPr>
+        <w:t>Command</w:t>
+      </w:r>
+    </w:p>
+    <w:p>
+      <w:r>
+        <w:t>git switch main</w:t>
+      </w:r>
+    </w:p>
+    <w:p>
+      <w:r>
+        <w:rPr>
+          <w:b/>
+          <w:bCs/>
+        </w:rPr>
+        <w:t>Output</w:t>
+      </w:r>
+      <w:r>
+        <w:rPr>
+          <w:noProof/>
+        </w:rPr>
+        <w:t xml:space="preserve"> </w:t>
+      </w:r>
+      <w:r>
+        <w:rPr>
+          <w:noProof/>
+        </w:rPr>
+        <w:t>:</w:t>
+      </w:r>
+      <w:r>
+        <w:rPr>
+          <w:b/>
+          <w:bCs/>
+        </w:rPr>
+        <w:drawing>
+          <wp:inline distT="0" distB="0" distL="0" distR="0" wp14:anchorId="0D25F634" wp14:editId="589C62F6">
+            <wp:extent cx="5731510" cy="616585"/>
+            <wp:effectExtent l="0" t="0" r="2540" b="0"/>
+            <wp:docPr id="685827927" name="Picture 1"/>
+            <wp:cNvGraphicFramePr>
+              <a:graphicFrameLocks xmlns:a="http://schemas.openxmlformats.org/drawingml/2006/main" noChangeAspect="1"/>
+            </wp:cNvGraphicFramePr>
+            <a:graphic xmlns:a="http://schemas.openxmlformats.org/drawingml/2006/main">
+              <a:graphicData uri="http://schemas.openxmlformats.org/drawingml/2006/picture">
+                <pic:pic xmlns:pic="http://schemas.openxmlformats.org/drawingml/2006/picture">
+                  <pic:nvPicPr>
+                    <pic:cNvPr id="685827927" name=""/>
+                    <pic:cNvPicPr/>
+                  </pic:nvPicPr>
+                  <pic:blipFill>
+                    <a:blip r:embed="rId9"/>
+                    <a:stretch>
+                      <a:fillRect/>
+                    </a:stretch>
+                  </pic:blipFill>
+                  <pic:spPr>
+                    <a:xfrm>
+                      <a:off x="0" y="0"/>
+                      <a:ext cx="5731510" cy="616585"/>
+                    </a:xfrm>
+                    <a:prstGeom prst="rect">
+                      <a:avLst/>
+                    </a:prstGeom>
+                  </pic:spPr>
+                </pic:pic>
+              </a:graphicData>
+            </a:graphic>
+          </wp:inline>
+        </w:drawing>
       </w:r>
     </w:p>
     <w:p>
@@ -355,21 +701,13 @@
       </w:r>
       <w:r>
         <w:br/>
-        <w:t xml:space="preserve">Created hello.xml in </w:t>
-      </w:r>
-      <w:proofErr w:type="spellStart"/>
-      <w:r>
-        <w:t>GitWork</w:t>
-      </w:r>
-      <w:proofErr w:type="spellEnd"/>
-      <w:r>
-        <w:t xml:space="preserve"> branch.</w:t>
-      </w:r>
-    </w:p>
-    <w:p>
-      <w:r>
-        <w:pict w14:anchorId="46083382">
-          <v:rect id="_x0000_i1143" style="width:0;height:1.5pt" o:hralign="center" o:hrstd="t" o:hr="t" fillcolor="#a0a0a0" stroked="f"/>
+        <w:t>Switched back to the main branch.</w:t>
+      </w:r>
+    </w:p>
+    <w:p>
+      <w:r>
+        <w:pict w14:anchorId="596F2AC0">
+          <v:rect id="_x0000_i1031" style="width:0;height:1.5pt" o:hralign="center" o:hrstd="t" o:hr="t" fillcolor="#a0a0a0" stroked="f"/>
         </w:pict>
       </w:r>
     </w:p>
@@ -385,40 +723,27 @@
           <w:b/>
           <w:bCs/>
         </w:rPr>
-        <w:t>Step 4: Commit Changes</w:t>
-      </w:r>
-    </w:p>
-    <w:p>
-      <w:pPr>
-        <w:rPr>
-          <w:b/>
-          <w:bCs/>
-        </w:rPr>
-      </w:pPr>
-      <w:r>
-        <w:rPr>
-          <w:b/>
-          <w:bCs/>
-        </w:rPr>
-        <w:t>Commands</w:t>
-      </w:r>
-    </w:p>
-    <w:p>
-      <w:r>
-        <w:t>git add hello.xml</w:t>
-      </w:r>
-    </w:p>
-    <w:p>
-      <w:r>
-        <w:t xml:space="preserve">git commit -m "Added hello.xml in </w:t>
-      </w:r>
-      <w:proofErr w:type="spellStart"/>
-      <w:r>
-        <w:t>GitWork</w:t>
-      </w:r>
-      <w:proofErr w:type="spellEnd"/>
-      <w:r>
-        <w:t>"</w:t>
+        <w:t>Step 6: Create hello.xml with Different Content</w:t>
+      </w:r>
+    </w:p>
+    <w:p>
+      <w:pPr>
+        <w:rPr>
+          <w:b/>
+          <w:bCs/>
+        </w:rPr>
+      </w:pPr>
+      <w:r>
+        <w:rPr>
+          <w:b/>
+          <w:bCs/>
+        </w:rPr>
+        <w:t>Command</w:t>
+      </w:r>
+    </w:p>
+    <w:p>
+      <w:r>
+        <w:t>echo "&lt;message&gt;Hello from Main&lt;/message&gt;" &gt; hello.xml</w:t>
       </w:r>
     </w:p>
     <w:p>
@@ -437,10 +762,42 @@
           <w:i/>
           <w:iCs/>
         </w:rPr>
-        <w:t>(Paste Screenshot Here)</w:t>
-      </w:r>
-    </w:p>
-    <w:p>
+        <w:drawing>
+          <wp:inline distT="0" distB="0" distL="0" distR="0" wp14:anchorId="0A1B90DD" wp14:editId="1726576C">
+            <wp:extent cx="5731510" cy="292100"/>
+            <wp:effectExtent l="0" t="0" r="2540" b="0"/>
+            <wp:docPr id="1534334934" name="Picture 1"/>
+            <wp:cNvGraphicFramePr>
+              <a:graphicFrameLocks xmlns:a="http://schemas.openxmlformats.org/drawingml/2006/main" noChangeAspect="1"/>
+            </wp:cNvGraphicFramePr>
+            <a:graphic xmlns:a="http://schemas.openxmlformats.org/drawingml/2006/main">
+              <a:graphicData uri="http://schemas.openxmlformats.org/drawingml/2006/picture">
+                <pic:pic xmlns:pic="http://schemas.openxmlformats.org/drawingml/2006/picture">
+                  <pic:nvPicPr>
+                    <pic:cNvPr id="1534334934" name=""/>
+                    <pic:cNvPicPr/>
+                  </pic:nvPicPr>
+                  <pic:blipFill>
+                    <a:blip r:embed="rId10"/>
+                    <a:stretch>
+                      <a:fillRect/>
+                    </a:stretch>
+                  </pic:blipFill>
+                  <pic:spPr>
+                    <a:xfrm>
+                      <a:off x="0" y="0"/>
+                      <a:ext cx="5731510" cy="292100"/>
+                    </a:xfrm>
+                    <a:prstGeom prst="rect">
+                      <a:avLst/>
+                    </a:prstGeom>
+                  </pic:spPr>
+                </pic:pic>
+              </a:graphicData>
+            </a:graphic>
+          </wp:inline>
+        </w:drawing>
+      </w:r>
       <w:r>
         <w:rPr>
           <w:b/>
@@ -450,13 +807,13 @@
       </w:r>
       <w:r>
         <w:br/>
-        <w:t>The file was committed successfully.</w:t>
-      </w:r>
-    </w:p>
-    <w:p>
-      <w:r>
-        <w:pict w14:anchorId="43ACDB8B">
-          <v:rect id="_x0000_i1144" style="width:0;height:1.5pt" o:hralign="center" o:hrstd="t" o:hr="t" fillcolor="#a0a0a0" stroked="f"/>
+        <w:t>Created another version of hello.xml with different content.</w:t>
+      </w:r>
+    </w:p>
+    <w:p>
+      <w:r>
+        <w:pict w14:anchorId="18C7FDFD">
+          <v:rect id="_x0000_i1032" style="width:0;height:1.5pt" o:hralign="center" o:hrstd="t" o:hr="t" fillcolor="#a0a0a0" stroked="f"/>
         </w:pict>
       </w:r>
     </w:p>
@@ -472,35 +829,32 @@
           <w:b/>
           <w:bCs/>
         </w:rPr>
-        <w:t>Step 5: Switch to Main Branch</w:t>
-      </w:r>
-    </w:p>
-    <w:p>
-      <w:pPr>
-        <w:rPr>
-          <w:b/>
-          <w:bCs/>
-        </w:rPr>
-      </w:pPr>
-      <w:r>
-        <w:rPr>
-          <w:b/>
-          <w:bCs/>
-        </w:rPr>
-        <w:t>Command</w:t>
-      </w:r>
-    </w:p>
-    <w:p>
-      <w:r>
-        <w:t xml:space="preserve">git </w:t>
-      </w:r>
-      <w:proofErr w:type="gramStart"/>
-      <w:r>
-        <w:t>switch</w:t>
-      </w:r>
-      <w:proofErr w:type="gramEnd"/>
-      <w:r>
-        <w:t xml:space="preserve"> main</w:t>
+        <w:t>Step 7: Commit Changes</w:t>
+      </w:r>
+    </w:p>
+    <w:p>
+      <w:pPr>
+        <w:rPr>
+          <w:b/>
+          <w:bCs/>
+        </w:rPr>
+      </w:pPr>
+      <w:r>
+        <w:rPr>
+          <w:b/>
+          <w:bCs/>
+        </w:rPr>
+        <w:t>Commands</w:t>
+      </w:r>
+    </w:p>
+    <w:p>
+      <w:r>
+        <w:t>git add hello.xml</w:t>
+      </w:r>
+    </w:p>
+    <w:p>
+      <w:r>
+        <w:t>git commit -m "Added hello.xml in main"</w:t>
       </w:r>
     </w:p>
     <w:p>
@@ -519,7 +873,41 @@
           <w:i/>
           <w:iCs/>
         </w:rPr>
-        <w:t>(Paste Screenshot Here)</w:t>
+        <w:drawing>
+          <wp:inline distT="0" distB="0" distL="0" distR="0" wp14:anchorId="07F44AA2" wp14:editId="7E09B1BE">
+            <wp:extent cx="5731510" cy="894715"/>
+            <wp:effectExtent l="0" t="0" r="2540" b="635"/>
+            <wp:docPr id="2063303429" name="Picture 1"/>
+            <wp:cNvGraphicFramePr>
+              <a:graphicFrameLocks xmlns:a="http://schemas.openxmlformats.org/drawingml/2006/main" noChangeAspect="1"/>
+            </wp:cNvGraphicFramePr>
+            <a:graphic xmlns:a="http://schemas.openxmlformats.org/drawingml/2006/main">
+              <a:graphicData uri="http://schemas.openxmlformats.org/drawingml/2006/picture">
+                <pic:pic xmlns:pic="http://schemas.openxmlformats.org/drawingml/2006/picture">
+                  <pic:nvPicPr>
+                    <pic:cNvPr id="2063303429" name=""/>
+                    <pic:cNvPicPr/>
+                  </pic:nvPicPr>
+                  <pic:blipFill>
+                    <a:blip r:embed="rId11"/>
+                    <a:stretch>
+                      <a:fillRect/>
+                    </a:stretch>
+                  </pic:blipFill>
+                  <pic:spPr>
+                    <a:xfrm>
+                      <a:off x="0" y="0"/>
+                      <a:ext cx="5731510" cy="894715"/>
+                    </a:xfrm>
+                    <a:prstGeom prst="rect">
+                      <a:avLst/>
+                    </a:prstGeom>
+                  </pic:spPr>
+                </pic:pic>
+              </a:graphicData>
+            </a:graphic>
+          </wp:inline>
+        </w:drawing>
       </w:r>
     </w:p>
     <w:p>
@@ -532,13 +920,13 @@
       </w:r>
       <w:r>
         <w:br/>
-        <w:t>Switched back to the main branch.</w:t>
-      </w:r>
-    </w:p>
-    <w:p>
-      <w:r>
-        <w:pict w14:anchorId="596F2AC0">
-          <v:rect id="_x0000_i1145" style="width:0;height:1.5pt" o:hralign="center" o:hrstd="t" o:hr="t" fillcolor="#a0a0a0" stroked="f"/>
+        <w:t>Changes were committed successfully.</w:t>
+      </w:r>
+    </w:p>
+    <w:p>
+      <w:r>
+        <w:pict w14:anchorId="4B679E83">
+          <v:rect id="_x0000_i1033" style="width:0;height:1.5pt" o:hralign="center" o:hrstd="t" o:hr="t" fillcolor="#a0a0a0" stroked="f"/>
         </w:pict>
       </w:r>
     </w:p>
@@ -554,7 +942,7 @@
           <w:b/>
           <w:bCs/>
         </w:rPr>
-        <w:t>Step 6: Create hello.xml with Different Content</w:t>
+        <w:t>Step 8: View Git Log</w:t>
       </w:r>
     </w:p>
     <w:p>
@@ -574,15 +962,24 @@
     </w:p>
     <w:p>
       <w:r>
-        <w:t>echo "&lt;message&gt;Hello from Main&lt;/message&gt;" &gt; hello.xml</w:t>
-      </w:r>
-    </w:p>
-    <w:p>
-      <w:r>
-        <w:rPr>
-          <w:b/>
-          <w:bCs/>
-        </w:rPr>
+        <w:t>git log --</w:t>
+      </w:r>
+      <w:proofErr w:type="spellStart"/>
+      <w:r>
+        <w:t>oneline</w:t>
+      </w:r>
+      <w:proofErr w:type="spellEnd"/>
+      <w:r>
+        <w:t xml:space="preserve"> --graph --decorate --all</w:t>
+      </w:r>
+    </w:p>
+    <w:p>
+      <w:r>
+        <w:rPr>
+          <w:b/>
+          <w:bCs/>
+        </w:rPr>
+        <w:lastRenderedPageBreak/>
         <w:t>Output:</w:t>
       </w:r>
       <w:r>
@@ -593,26 +990,45 @@
           <w:i/>
           <w:iCs/>
         </w:rPr>
-        <w:t>(Paste Screenshot Here)</w:t>
-      </w:r>
-    </w:p>
-    <w:p>
-      <w:r>
-        <w:rPr>
-          <w:b/>
-          <w:bCs/>
-        </w:rPr>
-        <w:t>Observation:</w:t>
-      </w:r>
-      <w:r>
-        <w:br/>
-        <w:t>Created another version of hello.xml with different content.</w:t>
-      </w:r>
-    </w:p>
-    <w:p>
-      <w:r>
-        <w:pict w14:anchorId="18C7FDFD">
-          <v:rect id="_x0000_i1146" style="width:0;height:1.5pt" o:hralign="center" o:hrstd="t" o:hr="t" fillcolor="#a0a0a0" stroked="f"/>
+        <w:drawing>
+          <wp:inline distT="0" distB="0" distL="0" distR="0" wp14:anchorId="2150D2AC" wp14:editId="3408F0B5">
+            <wp:extent cx="5731510" cy="3502660"/>
+            <wp:effectExtent l="0" t="0" r="2540" b="2540"/>
+            <wp:docPr id="821638249" name="Picture 1"/>
+            <wp:cNvGraphicFramePr>
+              <a:graphicFrameLocks xmlns:a="http://schemas.openxmlformats.org/drawingml/2006/main" noChangeAspect="1"/>
+            </wp:cNvGraphicFramePr>
+            <a:graphic xmlns:a="http://schemas.openxmlformats.org/drawingml/2006/main">
+              <a:graphicData uri="http://schemas.openxmlformats.org/drawingml/2006/picture">
+                <pic:pic xmlns:pic="http://schemas.openxmlformats.org/drawingml/2006/picture">
+                  <pic:nvPicPr>
+                    <pic:cNvPr id="821638249" name=""/>
+                    <pic:cNvPicPr/>
+                  </pic:nvPicPr>
+                  <pic:blipFill>
+                    <a:blip r:embed="rId12"/>
+                    <a:stretch>
+                      <a:fillRect/>
+                    </a:stretch>
+                  </pic:blipFill>
+                  <pic:spPr>
+                    <a:xfrm>
+                      <a:off x="0" y="0"/>
+                      <a:ext cx="5731510" cy="3502660"/>
+                    </a:xfrm>
+                    <a:prstGeom prst="rect">
+                      <a:avLst/>
+                    </a:prstGeom>
+                  </pic:spPr>
+                </pic:pic>
+              </a:graphicData>
+            </a:graphic>
+          </wp:inline>
+        </w:drawing>
+      </w:r>
+      <w:r>
+        <w:pict w14:anchorId="6138EBFE">
+          <v:rect id="_x0000_i1034" style="width:0;height:1.5pt" o:hralign="center" o:hrstd="t" o:hr="t" fillcolor="#a0a0a0" stroked="f"/>
         </w:pict>
       </w:r>
     </w:p>
@@ -628,33 +1044,160 @@
           <w:b/>
           <w:bCs/>
         </w:rPr>
-        <w:t>Step 7: Commit Changes</w:t>
-      </w:r>
-    </w:p>
-    <w:p>
-      <w:pPr>
-        <w:rPr>
-          <w:b/>
-          <w:bCs/>
-        </w:rPr>
-      </w:pPr>
-      <w:r>
-        <w:rPr>
-          <w:b/>
-          <w:bCs/>
-        </w:rPr>
-        <w:t>Commands</w:t>
-      </w:r>
-    </w:p>
-    <w:p>
-      <w:r>
-        <w:t>git add hello.xml</w:t>
-      </w:r>
-    </w:p>
-    <w:p>
-      <w:r>
-        <w:t>git commit -m "Added hello.xml in main"</w:t>
-      </w:r>
+        <w:t>Step 9: Compare Branches</w:t>
+      </w:r>
+    </w:p>
+    <w:p>
+      <w:pPr>
+        <w:rPr>
+          <w:b/>
+          <w:bCs/>
+        </w:rPr>
+      </w:pPr>
+      <w:r>
+        <w:rPr>
+          <w:b/>
+          <w:bCs/>
+        </w:rPr>
+        <w:t>Command</w:t>
+      </w:r>
+    </w:p>
+    <w:p>
+      <w:r>
+        <w:t xml:space="preserve">git diff main </w:t>
+      </w:r>
+      <w:proofErr w:type="spellStart"/>
+      <w:r>
+        <w:t>GitWork</w:t>
+      </w:r>
+      <w:proofErr w:type="spellEnd"/>
+    </w:p>
+    <w:p>
+      <w:r>
+        <w:rPr>
+          <w:b/>
+          <w:bCs/>
+        </w:rPr>
+        <w:t>Output:</w:t>
+      </w:r>
+      <w:r>
+        <w:t xml:space="preserve"> </w:t>
+      </w:r>
+      <w:r>
+        <w:rPr>
+          <w:i/>
+          <w:iCs/>
+        </w:rPr>
+        <w:drawing>
+          <wp:inline distT="0" distB="0" distL="0" distR="0" wp14:anchorId="6F4E0358" wp14:editId="0DE18108">
+            <wp:extent cx="5731510" cy="1125855"/>
+            <wp:effectExtent l="0" t="0" r="2540" b="0"/>
+            <wp:docPr id="62718984" name="Picture 1"/>
+            <wp:cNvGraphicFramePr>
+              <a:graphicFrameLocks xmlns:a="http://schemas.openxmlformats.org/drawingml/2006/main" noChangeAspect="1"/>
+            </wp:cNvGraphicFramePr>
+            <a:graphic xmlns:a="http://schemas.openxmlformats.org/drawingml/2006/main">
+              <a:graphicData uri="http://schemas.openxmlformats.org/drawingml/2006/picture">
+                <pic:pic xmlns:pic="http://schemas.openxmlformats.org/drawingml/2006/picture">
+                  <pic:nvPicPr>
+                    <pic:cNvPr id="62718984" name=""/>
+                    <pic:cNvPicPr/>
+                  </pic:nvPicPr>
+                  <pic:blipFill>
+                    <a:blip r:embed="rId13"/>
+                    <a:stretch>
+                      <a:fillRect/>
+                    </a:stretch>
+                  </pic:blipFill>
+                  <pic:spPr>
+                    <a:xfrm>
+                      <a:off x="0" y="0"/>
+                      <a:ext cx="5731510" cy="1125855"/>
+                    </a:xfrm>
+                    <a:prstGeom prst="rect">
+                      <a:avLst/>
+                    </a:prstGeom>
+                  </pic:spPr>
+                </pic:pic>
+              </a:graphicData>
+            </a:graphic>
+          </wp:inline>
+        </w:drawing>
+      </w:r>
+    </w:p>
+    <w:p>
+      <w:r>
+        <w:pict w14:anchorId="5FC25865">
+          <v:rect id="_x0000_i1035" style="width:0;height:1.5pt" o:hralign="center" o:hrstd="t" o:hr="t" fillcolor="#a0a0a0" stroked="f"/>
+        </w:pict>
+      </w:r>
+    </w:p>
+    <w:p>
+      <w:pPr>
+        <w:rPr>
+          <w:b/>
+          <w:bCs/>
+        </w:rPr>
+      </w:pPr>
+      <w:r>
+        <w:rPr>
+          <w:b/>
+          <w:bCs/>
+        </w:rPr>
+        <w:t>Step 10: P4Merge</w:t>
+      </w:r>
+    </w:p>
+    <w:p>
+      <w:r>
+        <w:t>P4Merge was not configured on the local system. Therefore, comparison was performed using git diff.</w:t>
+      </w:r>
+    </w:p>
+    <w:p>
+      <w:r>
+        <w:pict w14:anchorId="3DC614D3">
+          <v:rect id="_x0000_i1036" style="width:0;height:1.5pt" o:hralign="center" o:hrstd="t" o:hr="t" fillcolor="#a0a0a0" stroked="f"/>
+        </w:pict>
+      </w:r>
+    </w:p>
+    <w:p>
+      <w:pPr>
+        <w:rPr>
+          <w:b/>
+          <w:bCs/>
+        </w:rPr>
+      </w:pPr>
+      <w:r>
+        <w:rPr>
+          <w:b/>
+          <w:bCs/>
+        </w:rPr>
+        <w:t>Step 11: Merge Branch</w:t>
+      </w:r>
+    </w:p>
+    <w:p>
+      <w:pPr>
+        <w:rPr>
+          <w:b/>
+          <w:bCs/>
+        </w:rPr>
+      </w:pPr>
+      <w:r>
+        <w:rPr>
+          <w:b/>
+          <w:bCs/>
+        </w:rPr>
+        <w:t>Command</w:t>
+      </w:r>
+    </w:p>
+    <w:p>
+      <w:r>
+        <w:t xml:space="preserve">git merge </w:t>
+      </w:r>
+      <w:proofErr w:type="spellStart"/>
+      <w:r>
+        <w:t>GitWork</w:t>
+      </w:r>
+      <w:proofErr w:type="spellEnd"/>
     </w:p>
     <w:p>
       <w:r>
@@ -673,7 +1216,41 @@
           <w:i/>
           <w:iCs/>
         </w:rPr>
-        <w:t>(Paste Screenshot Here)</w:t>
+        <w:drawing>
+          <wp:inline distT="0" distB="0" distL="0" distR="0" wp14:anchorId="716D8E3A" wp14:editId="2FEBE52D">
+            <wp:extent cx="5731510" cy="600710"/>
+            <wp:effectExtent l="0" t="0" r="2540" b="8890"/>
+            <wp:docPr id="2075845136" name="Picture 1"/>
+            <wp:cNvGraphicFramePr>
+              <a:graphicFrameLocks xmlns:a="http://schemas.openxmlformats.org/drawingml/2006/main" noChangeAspect="1"/>
+            </wp:cNvGraphicFramePr>
+            <a:graphic xmlns:a="http://schemas.openxmlformats.org/drawingml/2006/main">
+              <a:graphicData uri="http://schemas.openxmlformats.org/drawingml/2006/picture">
+                <pic:pic xmlns:pic="http://schemas.openxmlformats.org/drawingml/2006/picture">
+                  <pic:nvPicPr>
+                    <pic:cNvPr id="2075845136" name=""/>
+                    <pic:cNvPicPr/>
+                  </pic:nvPicPr>
+                  <pic:blipFill>
+                    <a:blip r:embed="rId14"/>
+                    <a:stretch>
+                      <a:fillRect/>
+                    </a:stretch>
+                  </pic:blipFill>
+                  <pic:spPr>
+                    <a:xfrm>
+                      <a:off x="0" y="0"/>
+                      <a:ext cx="5731510" cy="600710"/>
+                    </a:xfrm>
+                    <a:prstGeom prst="rect">
+                      <a:avLst/>
+                    </a:prstGeom>
+                  </pic:spPr>
+                </pic:pic>
+              </a:graphicData>
+            </a:graphic>
+          </wp:inline>
+        </w:drawing>
       </w:r>
     </w:p>
     <w:p>
@@ -686,13 +1263,13 @@
       </w:r>
       <w:r>
         <w:br/>
-        <w:t>Changes were committed successfully.</w:t>
-      </w:r>
-    </w:p>
-    <w:p>
-      <w:r>
-        <w:pict w14:anchorId="4B679E83">
-          <v:rect id="_x0000_i1147" style="width:0;height:1.5pt" o:hralign="center" o:hrstd="t" o:hr="t" fillcolor="#a0a0a0" stroked="f"/>
+        <w:t>A merge conflict occurred because both branches modified the same file.</w:t>
+      </w:r>
+    </w:p>
+    <w:p>
+      <w:r>
+        <w:pict w14:anchorId="7319BF56">
+          <v:rect id="_x0000_i1037" style="width:0;height:1.5pt" o:hralign="center" o:hrstd="t" o:hr="t" fillcolor="#a0a0a0" stroked="f"/>
         </w:pict>
       </w:r>
     </w:p>
@@ -708,35 +1285,132 @@
           <w:b/>
           <w:bCs/>
         </w:rPr>
-        <w:t>Step 8: View Git Log</w:t>
-      </w:r>
-    </w:p>
-    <w:p>
-      <w:pPr>
-        <w:rPr>
-          <w:b/>
-          <w:bCs/>
-        </w:rPr>
-      </w:pPr>
-      <w:r>
-        <w:rPr>
-          <w:b/>
-          <w:bCs/>
-        </w:rPr>
-        <w:t>Command</w:t>
-      </w:r>
-    </w:p>
-    <w:p>
-      <w:r>
-        <w:t>git log --</w:t>
+        <w:t>Step 12: Conflict Markers</w:t>
+      </w:r>
+    </w:p>
+    <w:p>
+      <w:r>
+        <w:t>Open hello.xml.</w:t>
+      </w:r>
+    </w:p>
+    <w:p>
+      <w:r>
+        <w:t>It will look similar to:</w:t>
+      </w:r>
+    </w:p>
+    <w:p>
+      <w:r>
+        <w:t>&lt;&lt;&lt;&lt;&lt;&lt;&lt; HEAD</w:t>
+      </w:r>
+    </w:p>
+    <w:p>
+      <w:r>
+        <w:t>&lt;message&gt;Hello from Main&lt;/message&gt;</w:t>
+      </w:r>
+    </w:p>
+    <w:p>
+      <w:r>
+        <w:t>=======</w:t>
+      </w:r>
+    </w:p>
+    <w:p>
+      <w:r>
+        <w:t xml:space="preserve">&lt;message&gt;Hello from </w:t>
       </w:r>
       <w:proofErr w:type="spellStart"/>
       <w:r>
-        <w:t>oneline</w:t>
+        <w:t>GitWork</w:t>
       </w:r>
       <w:proofErr w:type="spellEnd"/>
       <w:r>
-        <w:t xml:space="preserve"> --graph --decorate --all</w:t>
+        <w:t>&lt;/message&gt;</w:t>
+      </w:r>
+    </w:p>
+    <w:p>
+      <w:r>
+        <w:t xml:space="preserve">&gt;&gt;&gt;&gt;&gt;&gt;&gt; </w:t>
+      </w:r>
+      <w:proofErr w:type="spellStart"/>
+      <w:r>
+        <w:t>GitWork</w:t>
+      </w:r>
+      <w:proofErr w:type="spellEnd"/>
+    </w:p>
+    <w:p>
+      <w:r>
+        <w:pict w14:anchorId="3DCE3A88">
+          <v:rect id="_x0000_i1038" style="width:0;height:1.5pt" o:hralign="center" o:hrstd="t" o:hr="t" fillcolor="#a0a0a0" stroked="f"/>
+        </w:pict>
+      </w:r>
+    </w:p>
+    <w:p>
+      <w:pPr>
+        <w:rPr>
+          <w:b/>
+          <w:bCs/>
+        </w:rPr>
+      </w:pPr>
+      <w:r>
+        <w:rPr>
+          <w:b/>
+          <w:bCs/>
+        </w:rPr>
+        <w:t>Step 13: Resolve Conflict</w:t>
+      </w:r>
+    </w:p>
+    <w:p>
+      <w:r>
+        <w:t>Edit the file and keep the final content:</w:t>
+      </w:r>
+    </w:p>
+    <w:p>
+      <w:r>
+        <w:t xml:space="preserve">&lt;message&gt;Hello from Main and </w:t>
+      </w:r>
+      <w:proofErr w:type="spellStart"/>
+      <w:r>
+        <w:t>GitWork</w:t>
+      </w:r>
+      <w:proofErr w:type="spellEnd"/>
+      <w:r>
+        <w:t>&lt;/message&gt;</w:t>
+      </w:r>
+    </w:p>
+    <w:p>
+      <w:r>
+        <w:t>Save the file.</w:t>
+      </w:r>
+    </w:p>
+    <w:p>
+      <w:r>
+        <w:pict w14:anchorId="2BA849A6">
+          <v:rect id="_x0000_i1039" style="width:0;height:1.5pt" o:hralign="center" o:hrstd="t" o:hr="t" fillcolor="#a0a0a0" stroked="f"/>
+        </w:pict>
+      </w:r>
+    </w:p>
+    <w:p>
+      <w:pPr>
+        <w:rPr>
+          <w:b/>
+          <w:bCs/>
+        </w:rPr>
+      </w:pPr>
+      <w:r>
+        <w:rPr>
+          <w:b/>
+          <w:bCs/>
+        </w:rPr>
+        <w:t>Step 14: Commit Merge</w:t>
+      </w:r>
+    </w:p>
+    <w:p>
+      <w:r>
+        <w:t>git add hello.xml</w:t>
+      </w:r>
+    </w:p>
+    <w:p>
+      <w:r>
+        <w:t>git commit -m "Resolved merge conflict"</w:t>
       </w:r>
     </w:p>
     <w:p>
@@ -755,13 +1429,47 @@
           <w:i/>
           <w:iCs/>
         </w:rPr>
-        <w:t>(Paste Screenshot Here)</w:t>
-      </w:r>
-    </w:p>
-    <w:p>
-      <w:r>
-        <w:pict w14:anchorId="6138EBFE">
-          <v:rect id="_x0000_i1148" style="width:0;height:1.5pt" o:hralign="center" o:hrstd="t" o:hr="t" fillcolor="#a0a0a0" stroked="f"/>
+        <w:drawing>
+          <wp:inline distT="0" distB="0" distL="0" distR="0" wp14:anchorId="0A1CD7F1" wp14:editId="624080E4">
+            <wp:extent cx="5731510" cy="653415"/>
+            <wp:effectExtent l="0" t="0" r="2540" b="0"/>
+            <wp:docPr id="1511617579" name="Picture 1"/>
+            <wp:cNvGraphicFramePr>
+              <a:graphicFrameLocks xmlns:a="http://schemas.openxmlformats.org/drawingml/2006/main" noChangeAspect="1"/>
+            </wp:cNvGraphicFramePr>
+            <a:graphic xmlns:a="http://schemas.openxmlformats.org/drawingml/2006/main">
+              <a:graphicData uri="http://schemas.openxmlformats.org/drawingml/2006/picture">
+                <pic:pic xmlns:pic="http://schemas.openxmlformats.org/drawingml/2006/picture">
+                  <pic:nvPicPr>
+                    <pic:cNvPr id="1511617579" name=""/>
+                    <pic:cNvPicPr/>
+                  </pic:nvPicPr>
+                  <pic:blipFill>
+                    <a:blip r:embed="rId15"/>
+                    <a:stretch>
+                      <a:fillRect/>
+                    </a:stretch>
+                  </pic:blipFill>
+                  <pic:spPr>
+                    <a:xfrm>
+                      <a:off x="0" y="0"/>
+                      <a:ext cx="5731510" cy="653415"/>
+                    </a:xfrm>
+                    <a:prstGeom prst="rect">
+                      <a:avLst/>
+                    </a:prstGeom>
+                  </pic:spPr>
+                </pic:pic>
+              </a:graphicData>
+            </a:graphic>
+          </wp:inline>
+        </w:drawing>
+      </w:r>
+    </w:p>
+    <w:p>
+      <w:r>
+        <w:pict w14:anchorId="721E41C3">
+          <v:rect id="_x0000_i1040" style="width:0;height:1.5pt" o:hralign="center" o:hrstd="t" o:hr="t" fillcolor="#a0a0a0" stroked="f"/>
         </w:pict>
       </w:r>
     </w:p>
@@ -777,33 +1485,71 @@
           <w:b/>
           <w:bCs/>
         </w:rPr>
-        <w:t>Step 9: Compare Branches</w:t>
-      </w:r>
-    </w:p>
-    <w:p>
-      <w:pPr>
-        <w:rPr>
-          <w:b/>
-          <w:bCs/>
-        </w:rPr>
-      </w:pPr>
-      <w:r>
-        <w:rPr>
-          <w:b/>
-          <w:bCs/>
-        </w:rPr>
-        <w:t>Command</w:t>
-      </w:r>
-    </w:p>
-    <w:p>
-      <w:r>
-        <w:t xml:space="preserve">git diff main </w:t>
+        <w:t>Step 15: Update .</w:t>
       </w:r>
       <w:proofErr w:type="spellStart"/>
       <w:r>
-        <w:t>GitWork</w:t>
+        <w:rPr>
+          <w:b/>
+          <w:bCs/>
+        </w:rPr>
+        <w:t>gitignore</w:t>
       </w:r>
       <w:proofErr w:type="spellEnd"/>
+    </w:p>
+    <w:p>
+      <w:r>
+        <w:lastRenderedPageBreak/>
+        <w:t>Add:</w:t>
+      </w:r>
+    </w:p>
+    <w:p>
+      <w:r>
+        <w:t>*.</w:t>
+      </w:r>
+      <w:proofErr w:type="spellStart"/>
+      <w:r>
+        <w:t>bak</w:t>
+      </w:r>
+      <w:proofErr w:type="spellEnd"/>
+    </w:p>
+    <w:p>
+      <w:pPr>
+        <w:rPr>
+          <w:b/>
+          <w:bCs/>
+        </w:rPr>
+      </w:pPr>
+      <w:r>
+        <w:rPr>
+          <w:b/>
+          <w:bCs/>
+        </w:rPr>
+        <w:t>Commands</w:t>
+      </w:r>
+    </w:p>
+    <w:p>
+      <w:r>
+        <w:t>git add .</w:t>
+      </w:r>
+      <w:proofErr w:type="spellStart"/>
+      <w:r>
+        <w:t>gitignore</w:t>
+      </w:r>
+      <w:proofErr w:type="spellEnd"/>
+    </w:p>
+    <w:p>
+      <w:r>
+        <w:t>git commit -m "Updated .</w:t>
+      </w:r>
+      <w:proofErr w:type="spellStart"/>
+      <w:r>
+        <w:t>gitignore</w:t>
+      </w:r>
+      <w:proofErr w:type="spellEnd"/>
+      <w:r>
+        <w:t>"</w:t>
+      </w:r>
     </w:p>
     <w:p>
       <w:r>
@@ -821,13 +1567,47 @@
           <w:i/>
           <w:iCs/>
         </w:rPr>
-        <w:t>(Paste Screenshot Here)</w:t>
-      </w:r>
-    </w:p>
-    <w:p>
-      <w:r>
-        <w:pict w14:anchorId="5FC25865">
-          <v:rect id="_x0000_i1149" style="width:0;height:1.5pt" o:hralign="center" o:hrstd="t" o:hr="t" fillcolor="#a0a0a0" stroked="f"/>
+        <w:drawing>
+          <wp:inline distT="0" distB="0" distL="0" distR="0" wp14:anchorId="7E8AD14A" wp14:editId="515D2898">
+            <wp:extent cx="5731510" cy="1615440"/>
+            <wp:effectExtent l="0" t="0" r="2540" b="3810"/>
+            <wp:docPr id="650546633" name="Picture 1"/>
+            <wp:cNvGraphicFramePr>
+              <a:graphicFrameLocks xmlns:a="http://schemas.openxmlformats.org/drawingml/2006/main" noChangeAspect="1"/>
+            </wp:cNvGraphicFramePr>
+            <a:graphic xmlns:a="http://schemas.openxmlformats.org/drawingml/2006/main">
+              <a:graphicData uri="http://schemas.openxmlformats.org/drawingml/2006/picture">
+                <pic:pic xmlns:pic="http://schemas.openxmlformats.org/drawingml/2006/picture">
+                  <pic:nvPicPr>
+                    <pic:cNvPr id="650546633" name=""/>
+                    <pic:cNvPicPr/>
+                  </pic:nvPicPr>
+                  <pic:blipFill>
+                    <a:blip r:embed="rId16"/>
+                    <a:stretch>
+                      <a:fillRect/>
+                    </a:stretch>
+                  </pic:blipFill>
+                  <pic:spPr>
+                    <a:xfrm>
+                      <a:off x="0" y="0"/>
+                      <a:ext cx="5731510" cy="1615440"/>
+                    </a:xfrm>
+                    <a:prstGeom prst="rect">
+                      <a:avLst/>
+                    </a:prstGeom>
+                  </pic:spPr>
+                </pic:pic>
+              </a:graphicData>
+            </a:graphic>
+          </wp:inline>
+        </w:drawing>
+      </w:r>
+    </w:p>
+    <w:p>
+      <w:r>
+        <w:pict w14:anchorId="0DCDDB97">
+          <v:rect id="_x0000_i1041" style="width:0;height:1.5pt" o:hralign="center" o:hrstd="t" o:hr="t" fillcolor="#a0a0a0" stroked="f"/>
         </w:pict>
       </w:r>
     </w:p>
@@ -843,37 +1623,71 @@
           <w:b/>
           <w:bCs/>
         </w:rPr>
-        <w:t>Step 10: P4Merge</w:t>
-      </w:r>
-    </w:p>
-    <w:p>
-      <w:r>
-        <w:t>If installed:</w:t>
-      </w:r>
-    </w:p>
-    <w:p>
+        <w:t>Step 16: List Branches</w:t>
+      </w:r>
+    </w:p>
+    <w:p>
+      <w:r>
+        <w:t>git branch</w:t>
+      </w:r>
+    </w:p>
+    <w:p>
+      <w:r>
+        <w:rPr>
+          <w:b/>
+          <w:bCs/>
+        </w:rPr>
+        <w:t>Output:</w:t>
+      </w:r>
+      <w:r>
+        <w:t xml:space="preserve"> </w:t>
+      </w:r>
       <w:r>
         <w:rPr>
           <w:i/>
           <w:iCs/>
         </w:rPr>
-        <w:t>(Paste Screenshot Here)</w:t>
-      </w:r>
-    </w:p>
-    <w:p>
-      <w:r>
-        <w:t>Otherwise write:</w:t>
-      </w:r>
-    </w:p>
-    <w:p>
-      <w:r>
-        <w:t>P4Merge was not configured on the local system. Therefore, comparison was performed using git diff.</w:t>
-      </w:r>
-    </w:p>
-    <w:p>
-      <w:r>
-        <w:pict w14:anchorId="3DC614D3">
-          <v:rect id="_x0000_i1150" style="width:0;height:1.5pt" o:hralign="center" o:hrstd="t" o:hr="t" fillcolor="#a0a0a0" stroked="f"/>
+        <w:drawing>
+          <wp:inline distT="0" distB="0" distL="0" distR="0" wp14:anchorId="2E7AA787" wp14:editId="3279A61C">
+            <wp:extent cx="5273497" cy="502964"/>
+            <wp:effectExtent l="0" t="0" r="3810" b="0"/>
+            <wp:docPr id="14299208" name="Picture 1"/>
+            <wp:cNvGraphicFramePr>
+              <a:graphicFrameLocks xmlns:a="http://schemas.openxmlformats.org/drawingml/2006/main" noChangeAspect="1"/>
+            </wp:cNvGraphicFramePr>
+            <a:graphic xmlns:a="http://schemas.openxmlformats.org/drawingml/2006/main">
+              <a:graphicData uri="http://schemas.openxmlformats.org/drawingml/2006/picture">
+                <pic:pic xmlns:pic="http://schemas.openxmlformats.org/drawingml/2006/picture">
+                  <pic:nvPicPr>
+                    <pic:cNvPr id="14299208" name=""/>
+                    <pic:cNvPicPr/>
+                  </pic:nvPicPr>
+                  <pic:blipFill>
+                    <a:blip r:embed="rId17"/>
+                    <a:stretch>
+                      <a:fillRect/>
+                    </a:stretch>
+                  </pic:blipFill>
+                  <pic:spPr>
+                    <a:xfrm>
+                      <a:off x="0" y="0"/>
+                      <a:ext cx="5273497" cy="502964"/>
+                    </a:xfrm>
+                    <a:prstGeom prst="rect">
+                      <a:avLst/>
+                    </a:prstGeom>
+                  </pic:spPr>
+                </pic:pic>
+              </a:graphicData>
+            </a:graphic>
+          </wp:inline>
+        </w:drawing>
+      </w:r>
+    </w:p>
+    <w:p>
+      <w:r>
+        <w:pict w14:anchorId="2D6DEC2D">
+          <v:rect id="_x0000_i1042" style="width:0;height:1.5pt" o:hralign="center" o:hrstd="t" o:hr="t" fillcolor="#a0a0a0" stroked="f"/>
         </w:pict>
       </w:r>
     </w:p>
@@ -889,27 +1703,12 @@
           <w:b/>
           <w:bCs/>
         </w:rPr>
-        <w:t>Step 11: Merge Branch</w:t>
-      </w:r>
-    </w:p>
-    <w:p>
-      <w:pPr>
-        <w:rPr>
-          <w:b/>
-          <w:bCs/>
-        </w:rPr>
-      </w:pPr>
-      <w:r>
-        <w:rPr>
-          <w:b/>
-          <w:bCs/>
-        </w:rPr>
-        <w:t>Command</w:t>
-      </w:r>
-    </w:p>
-    <w:p>
-      <w:r>
-        <w:t xml:space="preserve">git merge </w:t>
+        <w:t>Step 17: Delete Branch</w:t>
+      </w:r>
+    </w:p>
+    <w:p>
+      <w:r>
+        <w:t xml:space="preserve">git branch -d </w:t>
       </w:r>
       <w:proofErr w:type="spellStart"/>
       <w:r>
@@ -933,26 +1732,45 @@
           <w:i/>
           <w:iCs/>
         </w:rPr>
-        <w:t>(Paste Screenshot Here)</w:t>
-      </w:r>
-    </w:p>
-    <w:p>
-      <w:r>
-        <w:rPr>
-          <w:b/>
-          <w:bCs/>
-        </w:rPr>
-        <w:t>Observation:</w:t>
-      </w:r>
-      <w:r>
-        <w:br/>
-        <w:t>A merge conflict occurred because both branches modified the same file.</w:t>
-      </w:r>
-    </w:p>
-    <w:p>
-      <w:r>
-        <w:pict w14:anchorId="7319BF56">
-          <v:rect id="_x0000_i1151" style="width:0;height:1.5pt" o:hralign="center" o:hrstd="t" o:hr="t" fillcolor="#a0a0a0" stroked="f"/>
+        <w:drawing>
+          <wp:inline distT="0" distB="0" distL="0" distR="0" wp14:anchorId="3FFEE64B" wp14:editId="30D5A1A4">
+            <wp:extent cx="5227773" cy="381033"/>
+            <wp:effectExtent l="0" t="0" r="0" b="0"/>
+            <wp:docPr id="1611529234" name="Picture 1"/>
+            <wp:cNvGraphicFramePr>
+              <a:graphicFrameLocks xmlns:a="http://schemas.openxmlformats.org/drawingml/2006/main" noChangeAspect="1"/>
+            </wp:cNvGraphicFramePr>
+            <a:graphic xmlns:a="http://schemas.openxmlformats.org/drawingml/2006/main">
+              <a:graphicData uri="http://schemas.openxmlformats.org/drawingml/2006/picture">
+                <pic:pic xmlns:pic="http://schemas.openxmlformats.org/drawingml/2006/picture">
+                  <pic:nvPicPr>
+                    <pic:cNvPr id="1611529234" name=""/>
+                    <pic:cNvPicPr/>
+                  </pic:nvPicPr>
+                  <pic:blipFill>
+                    <a:blip r:embed="rId18"/>
+                    <a:stretch>
+                      <a:fillRect/>
+                    </a:stretch>
+                  </pic:blipFill>
+                  <pic:spPr>
+                    <a:xfrm>
+                      <a:off x="0" y="0"/>
+                      <a:ext cx="5227773" cy="381033"/>
+                    </a:xfrm>
+                    <a:prstGeom prst="rect">
+                      <a:avLst/>
+                    </a:prstGeom>
+                  </pic:spPr>
+                </pic:pic>
+              </a:graphicData>
+            </a:graphic>
+          </wp:inline>
+        </w:drawing>
+      </w:r>
+      <w:r>
+        <w:pict w14:anchorId="6D0A364A">
+          <v:rect id="_x0000_i1043" style="width:0;height:1.5pt" o:hralign="center" o:hrstd="t" o:hr="t" fillcolor="#a0a0a0" stroked="f"/>
         </w:pict>
       </w:r>
     </w:p>
@@ -968,152 +1786,29 @@
           <w:b/>
           <w:bCs/>
         </w:rPr>
-        <w:t>Step 12: Conflict Markers</w:t>
-      </w:r>
-    </w:p>
-    <w:p>
-      <w:r>
+        <w:t>Step 18: View Final Log</w:t>
+      </w:r>
+    </w:p>
+    <w:p>
+      <w:r>
+        <w:t>git log --</w:t>
+      </w:r>
+      <w:proofErr w:type="spellStart"/>
+      <w:r>
+        <w:t>oneline</w:t>
+      </w:r>
+      <w:proofErr w:type="spellEnd"/>
+      <w:r>
+        <w:t xml:space="preserve"> --graph --decorate</w:t>
+      </w:r>
+    </w:p>
+    <w:p>
+      <w:r>
+        <w:rPr>
+          <w:b/>
+          <w:bCs/>
+        </w:rPr>
         <w:lastRenderedPageBreak/>
-        <w:t>Open hello.xml.</w:t>
-      </w:r>
-    </w:p>
-    <w:p>
-      <w:r>
-        <w:t>It will look similar to:</w:t>
-      </w:r>
-    </w:p>
-    <w:p>
-      <w:r>
-        <w:t>&lt;&lt;&lt;&lt;&lt;&lt;&lt; HEAD</w:t>
-      </w:r>
-    </w:p>
-    <w:p>
-      <w:r>
-        <w:t>&lt;message&gt;Hello from Main&lt;/message&gt;</w:t>
-      </w:r>
-    </w:p>
-    <w:p>
-      <w:r>
-        <w:t>=======</w:t>
-      </w:r>
-    </w:p>
-    <w:p>
-      <w:r>
-        <w:t xml:space="preserve">&lt;message&gt;Hello from </w:t>
-      </w:r>
-      <w:proofErr w:type="spellStart"/>
-      <w:r>
-        <w:t>GitWork</w:t>
-      </w:r>
-      <w:proofErr w:type="spellEnd"/>
-      <w:r>
-        <w:t>&lt;/message&gt;</w:t>
-      </w:r>
-    </w:p>
-    <w:p>
-      <w:r>
-        <w:t xml:space="preserve">&gt;&gt;&gt;&gt;&gt;&gt;&gt; </w:t>
-      </w:r>
-      <w:proofErr w:type="spellStart"/>
-      <w:r>
-        <w:t>GitWork</w:t>
-      </w:r>
-      <w:proofErr w:type="spellEnd"/>
-    </w:p>
-    <w:p>
-      <w:r>
-        <w:rPr>
-          <w:rFonts w:ascii="Segoe UI Emoji" w:hAnsi="Segoe UI Emoji" w:cs="Segoe UI Emoji"/>
-        </w:rPr>
-        <w:t>📸</w:t>
-      </w:r>
-      <w:r>
-        <w:t xml:space="preserve"> Paste Screenshot.</w:t>
-      </w:r>
-    </w:p>
-    <w:p>
-      <w:r>
-        <w:pict w14:anchorId="3DCE3A88">
-          <v:rect id="_x0000_i1152" style="width:0;height:1.5pt" o:hralign="center" o:hrstd="t" o:hr="t" fillcolor="#a0a0a0" stroked="f"/>
-        </w:pict>
-      </w:r>
-    </w:p>
-    <w:p>
-      <w:pPr>
-        <w:rPr>
-          <w:b/>
-          <w:bCs/>
-        </w:rPr>
-      </w:pPr>
-      <w:r>
-        <w:rPr>
-          <w:b/>
-          <w:bCs/>
-        </w:rPr>
-        <w:t>Step 13: Resolve Conflict</w:t>
-      </w:r>
-    </w:p>
-    <w:p>
-      <w:r>
-        <w:t>Edit the file and keep the final content:</w:t>
-      </w:r>
-    </w:p>
-    <w:p>
-      <w:r>
-        <w:t xml:space="preserve">&lt;message&gt;Hello from Main and </w:t>
-      </w:r>
-      <w:proofErr w:type="spellStart"/>
-      <w:r>
-        <w:t>GitWork</w:t>
-      </w:r>
-      <w:proofErr w:type="spellEnd"/>
-      <w:r>
-        <w:t>&lt;/message&gt;</w:t>
-      </w:r>
-    </w:p>
-    <w:p>
-      <w:r>
-        <w:t>Save the file.</w:t>
-      </w:r>
-    </w:p>
-    <w:p>
-      <w:r>
-        <w:pict w14:anchorId="2BA849A6">
-          <v:rect id="_x0000_i1153" style="width:0;height:1.5pt" o:hralign="center" o:hrstd="t" o:hr="t" fillcolor="#a0a0a0" stroked="f"/>
-        </w:pict>
-      </w:r>
-    </w:p>
-    <w:p>
-      <w:pPr>
-        <w:rPr>
-          <w:b/>
-          <w:bCs/>
-        </w:rPr>
-      </w:pPr>
-      <w:r>
-        <w:rPr>
-          <w:b/>
-          <w:bCs/>
-        </w:rPr>
-        <w:t>Step 14: Commit Merge</w:t>
-      </w:r>
-    </w:p>
-    <w:p>
-      <w:r>
-        <w:t>git add hello.xml</w:t>
-      </w:r>
-    </w:p>
-    <w:p>
-      <w:r>
-        <w:t>git commit -m "Resolved merge conflict"</w:t>
-      </w:r>
-    </w:p>
-    <w:p>
-      <w:r>
-        <w:rPr>
-          <w:b/>
-          <w:bCs/>
-        </w:rPr>
         <w:t>Output:</w:t>
       </w:r>
       <w:r>
@@ -1124,281 +1819,41 @@
           <w:i/>
           <w:iCs/>
         </w:rPr>
-        <w:t>(Paste Screenshot Here)</w:t>
-      </w:r>
-    </w:p>
-    <w:p>
-      <w:r>
-        <w:pict w14:anchorId="721E41C3">
-          <v:rect id="_x0000_i1154" style="width:0;height:1.5pt" o:hralign="center" o:hrstd="t" o:hr="t" fillcolor="#a0a0a0" stroked="f"/>
-        </w:pict>
-      </w:r>
-    </w:p>
-    <w:p>
-      <w:pPr>
-        <w:rPr>
-          <w:b/>
-          <w:bCs/>
-        </w:rPr>
-      </w:pPr>
-      <w:r>
-        <w:rPr>
-          <w:b/>
-          <w:bCs/>
-        </w:rPr>
-        <w:t xml:space="preserve">Step 15: </w:t>
-      </w:r>
-      <w:proofErr w:type="gramStart"/>
-      <w:r>
-        <w:rPr>
-          <w:b/>
-          <w:bCs/>
-        </w:rPr>
-        <w:t>Update .</w:t>
-      </w:r>
-      <w:proofErr w:type="spellStart"/>
-      <w:r>
-        <w:rPr>
-          <w:b/>
-          <w:bCs/>
-        </w:rPr>
-        <w:t>gitignore</w:t>
-      </w:r>
-      <w:proofErr w:type="spellEnd"/>
-      <w:proofErr w:type="gramEnd"/>
-    </w:p>
-    <w:p>
-      <w:r>
-        <w:t>Add:</w:t>
-      </w:r>
-    </w:p>
-    <w:p>
-      <w:r>
-        <w:t>*.</w:t>
-      </w:r>
-      <w:proofErr w:type="spellStart"/>
-      <w:r>
-        <w:t>bak</w:t>
-      </w:r>
-      <w:proofErr w:type="spellEnd"/>
-    </w:p>
-    <w:p>
-      <w:pPr>
-        <w:rPr>
-          <w:b/>
-          <w:bCs/>
-        </w:rPr>
-      </w:pPr>
-      <w:r>
-        <w:rPr>
-          <w:b/>
-          <w:bCs/>
-        </w:rPr>
-        <w:t>Commands</w:t>
-      </w:r>
-    </w:p>
-    <w:p>
-      <w:r>
-        <w:t xml:space="preserve">git </w:t>
-      </w:r>
-      <w:proofErr w:type="gramStart"/>
-      <w:r>
-        <w:t>add .</w:t>
-      </w:r>
-      <w:proofErr w:type="spellStart"/>
-      <w:r>
-        <w:t>gitignore</w:t>
-      </w:r>
-      <w:proofErr w:type="spellEnd"/>
-      <w:proofErr w:type="gramEnd"/>
-    </w:p>
-    <w:p>
-      <w:r>
-        <w:t>git commit -m "</w:t>
-      </w:r>
-      <w:proofErr w:type="gramStart"/>
-      <w:r>
-        <w:t>Updated .</w:t>
-      </w:r>
-      <w:proofErr w:type="spellStart"/>
-      <w:r>
-        <w:t>gitignore</w:t>
-      </w:r>
-      <w:proofErr w:type="spellEnd"/>
-      <w:proofErr w:type="gramEnd"/>
-      <w:r>
-        <w:t>"</w:t>
-      </w:r>
-    </w:p>
-    <w:p>
-      <w:r>
-        <w:rPr>
-          <w:b/>
-          <w:bCs/>
-        </w:rPr>
-        <w:t>Output:</w:t>
-      </w:r>
-      <w:r>
-        <w:t xml:space="preserve"> </w:t>
-      </w:r>
-      <w:r>
-        <w:rPr>
-          <w:i/>
-          <w:iCs/>
-        </w:rPr>
-        <w:t>(Paste Screenshot Here)</w:t>
-      </w:r>
-    </w:p>
-    <w:p>
-      <w:r>
-        <w:pict w14:anchorId="0DCDDB97">
-          <v:rect id="_x0000_i1155" style="width:0;height:1.5pt" o:hralign="center" o:hrstd="t" o:hr="t" fillcolor="#a0a0a0" stroked="f"/>
-        </w:pict>
-      </w:r>
-    </w:p>
-    <w:p>
-      <w:pPr>
-        <w:rPr>
-          <w:b/>
-          <w:bCs/>
-        </w:rPr>
-      </w:pPr>
-      <w:r>
-        <w:rPr>
-          <w:b/>
-          <w:bCs/>
-        </w:rPr>
-        <w:t>Step 16: List Branches</w:t>
-      </w:r>
-    </w:p>
-    <w:p>
-      <w:r>
-        <w:lastRenderedPageBreak/>
-        <w:t>git branch</w:t>
-      </w:r>
-    </w:p>
-    <w:p>
-      <w:r>
-        <w:rPr>
-          <w:b/>
-          <w:bCs/>
-        </w:rPr>
-        <w:t>Output:</w:t>
-      </w:r>
-      <w:r>
-        <w:t xml:space="preserve"> </w:t>
-      </w:r>
-      <w:r>
-        <w:rPr>
-          <w:i/>
-          <w:iCs/>
-        </w:rPr>
-        <w:t>(Paste Screenshot Here)</w:t>
-      </w:r>
-    </w:p>
-    <w:p>
-      <w:r>
-        <w:pict w14:anchorId="2D6DEC2D">
-          <v:rect id="_x0000_i1156" style="width:0;height:1.5pt" o:hralign="center" o:hrstd="t" o:hr="t" fillcolor="#a0a0a0" stroked="f"/>
-        </w:pict>
-      </w:r>
-    </w:p>
-    <w:p>
-      <w:pPr>
-        <w:rPr>
-          <w:b/>
-          <w:bCs/>
-        </w:rPr>
-      </w:pPr>
-      <w:r>
-        <w:rPr>
-          <w:b/>
-          <w:bCs/>
-        </w:rPr>
-        <w:t>Step 17: Delete Branch</w:t>
-      </w:r>
-    </w:p>
-    <w:p>
-      <w:r>
-        <w:t xml:space="preserve">git branch -d </w:t>
-      </w:r>
-      <w:proofErr w:type="spellStart"/>
-      <w:r>
-        <w:t>GitWork</w:t>
-      </w:r>
-      <w:proofErr w:type="spellEnd"/>
-    </w:p>
-    <w:p>
-      <w:r>
-        <w:rPr>
-          <w:b/>
-          <w:bCs/>
-        </w:rPr>
-        <w:t>Output:</w:t>
-      </w:r>
-      <w:r>
-        <w:t xml:space="preserve"> </w:t>
-      </w:r>
-      <w:r>
-        <w:rPr>
-          <w:i/>
-          <w:iCs/>
-        </w:rPr>
-        <w:t>(Paste Screenshot Here)</w:t>
-      </w:r>
-    </w:p>
-    <w:p>
-      <w:r>
-        <w:pict w14:anchorId="6D0A364A">
-          <v:rect id="_x0000_i1157" style="width:0;height:1.5pt" o:hralign="center" o:hrstd="t" o:hr="t" fillcolor="#a0a0a0" stroked="f"/>
-        </w:pict>
-      </w:r>
-    </w:p>
-    <w:p>
-      <w:pPr>
-        <w:rPr>
-          <w:b/>
-          <w:bCs/>
-        </w:rPr>
-      </w:pPr>
-      <w:r>
-        <w:rPr>
-          <w:b/>
-          <w:bCs/>
-        </w:rPr>
-        <w:t>Step 18: View Final Log</w:t>
-      </w:r>
-    </w:p>
-    <w:p>
-      <w:r>
-        <w:t>git log --</w:t>
-      </w:r>
-      <w:proofErr w:type="spellStart"/>
-      <w:r>
-        <w:t>oneline</w:t>
-      </w:r>
-      <w:proofErr w:type="spellEnd"/>
-      <w:r>
-        <w:t xml:space="preserve"> --graph --decorate</w:t>
-      </w:r>
-    </w:p>
-    <w:p>
-      <w:r>
-        <w:rPr>
-          <w:b/>
-          <w:bCs/>
-        </w:rPr>
-        <w:t>Output:</w:t>
-      </w:r>
-      <w:r>
-        <w:t xml:space="preserve"> </w:t>
-      </w:r>
-      <w:r>
-        <w:rPr>
-          <w:i/>
-          <w:iCs/>
-        </w:rPr>
-        <w:t>(Paste Screenshot Here)</w:t>
+        <w:drawing>
+          <wp:inline distT="0" distB="0" distL="0" distR="0" wp14:anchorId="5C69D399" wp14:editId="62E78C64">
+            <wp:extent cx="5456393" cy="3825572"/>
+            <wp:effectExtent l="0" t="0" r="0" b="3810"/>
+            <wp:docPr id="1072566994" name="Picture 1"/>
+            <wp:cNvGraphicFramePr>
+              <a:graphicFrameLocks xmlns:a="http://schemas.openxmlformats.org/drawingml/2006/main" noChangeAspect="1"/>
+            </wp:cNvGraphicFramePr>
+            <a:graphic xmlns:a="http://schemas.openxmlformats.org/drawingml/2006/main">
+              <a:graphicData uri="http://schemas.openxmlformats.org/drawingml/2006/picture">
+                <pic:pic xmlns:pic="http://schemas.openxmlformats.org/drawingml/2006/picture">
+                  <pic:nvPicPr>
+                    <pic:cNvPr id="1072566994" name=""/>
+                    <pic:cNvPicPr/>
+                  </pic:nvPicPr>
+                  <pic:blipFill>
+                    <a:blip r:embed="rId19"/>
+                    <a:stretch>
+                      <a:fillRect/>
+                    </a:stretch>
+                  </pic:blipFill>
+                  <pic:spPr>
+                    <a:xfrm>
+                      <a:off x="0" y="0"/>
+                      <a:ext cx="5456393" cy="3825572"/>
+                    </a:xfrm>
+                    <a:prstGeom prst="rect">
+                      <a:avLst/>
+                    </a:prstGeom>
+                  </pic:spPr>
+                </pic:pic>
+              </a:graphicData>
+            </a:graphic>
+          </wp:inline>
+        </w:drawing>
       </w:r>
     </w:p>
     <w:p/>
@@ -2172,6 +2627,7 @@
   <w:style w:type="character" w:default="1" w:styleId="DefaultParagraphFont">
     <w:name w:val="Default Paragraph Font"/>
     <w:uiPriority w:val="1"/>
+    <w:semiHidden/>
     <w:unhideWhenUsed/>
   </w:style>
   <w:style w:type="table" w:default="1" w:styleId="TableNormal">

</xml_diff>